<commit_message>
Use CellPhenotyper GeoJSON conversion
</commit_message>
<xml_diff>
--- a/docs/Bora_manuscript.docx
+++ b/docs/Bora_manuscript.docx
@@ -1311,24 +1311,7 @@
           <w:rFonts w:ascii="Calibri" w:hAnsi="Calibri"/>
           <w:sz w:val="22"/>
         </w:rPr>
-        <w:t xml:space="preserve">The primary raster output is [sample]_refined.ome.tif, containing the level-0 integer label map and eight successively downsampled levels for the current whole-slide configuration. Bora writes tiled pyramidal OME-TIFF with lossless LZW compression and SIMPLE nearest-neighbour downsampling so categorical label IDs are not interpolated. The companion GeoJSON is generated before pyramid conversion from the authoritative level-0 raster. Each feature records label, CellPhenotyper-compatible value and classification, and area_px. Coordinates follow level-0 pixel edges. Large rasters are polygonized in bounded tiles with a one-pixel halo; geometries are clipped to non-overlapping tile interiors, repaired when invalid, and optionally simplified while preserving topology. The copied CellPhenotyper vectorizer remains the reference for future provenance-linked vector output. Rasterizing the GeoJSON must reproduce the mask within a prespecified tolerance of </w:t>
-      </w:r>
-      <w:r>
-        <w:rPr>
-          <w:rFonts w:ascii="Calibri" w:hAnsi="Calibri"/>
-          <w:b/>
-          <w:color w:val="9C5C00"/>
-          <w:sz w:val="22"/>
-          <w:highlight w:val="yellow"/>
-        </w:rPr>
-        <w:t>[TOLERANCE]</w:t>
-      </w:r>
-      <w:r>
-        <w:rPr>
-          <w:rFonts w:ascii="Calibri" w:hAnsi="Calibri"/>
-          <w:sz w:val="22"/>
-        </w:rPr>
-        <w:t xml:space="preserve"> pixels.</w:t>
+        <w:t>The primary raster output is [sample]_refined.ome.tif, containing the level-0 integer label map and eight successively downsampled levels for the current whole-slide configuration. Bora writes tiled pyramidal OME-TIFF with lossless LZW compression and SIMPLE nearest-neighbour downsampling so categorical label IDs are not interpolated. The companion GeoJSON is generated after pyramid conversion by an unchanged copy of CellPhenotyper's post-refinement mask_to_geojson.py (Git blob fd2dd40). Its default configuration selects the first pyramid level no larger than 2,048 pixels, maps coordinates back to level 0, dissolves regions by label value, drops regions below 500 level-0 pixel squared, performs three 10-pixel buffer/unbuffer smoothing passes, simplifies by 6 pixels with topology preservation, and removes holes. Each feature records a numeric value and CellPhenotyper-compatible classification. Because this representation is deliberately smoothed and hole-filled rather than lossless, raster round-trip agreement and per-label IoU must be reported alongside file size and geometry validity.</w:t>
       </w:r>
     </w:p>
     <w:p>

</xml_diff>

<commit_message>
Add boundary refinement experiments and journal draft
</commit_message>
<xml_diff>
--- a/docs/Bora_manuscript.docx
+++ b/docs/Bora_manuscript.docx
@@ -14,7 +14,7 @@
           <w:color w:val="1F4D78"/>
           <w:sz w:val="48"/>
         </w:rPr>
-        <w:t>Bora: scalable boundary-constrained refinement of tile-level tissue labels into pixel-accurate segmentations</w:t>
+        <w:t>Boundary refinement improves tissue extent but can erode semantic fidelity in gigapixel pathology maps</w:t>
       </w:r>
     </w:p>
     <w:p>
@@ -26,7 +26,7 @@
           <w:rFonts w:ascii="Calibri" w:hAnsi="Calibri"/>
           <w:sz w:val="22"/>
         </w:rPr>
-        <w:t>Manuscript type: Original Research Article Target journal: Medical Image Analysis Status: protocol-stage draft; all bracketed fields require completion before submission</w:t>
+        <w:t>Manuscript type: Article Target journal: Nature Communications Status: complete technical benchmark draft; author, ethics and release metadata remain to be supplied</w:t>
       </w:r>
     </w:p>
     <w:p>
@@ -141,162 +141,31 @@
         <w:pStyle w:val="Heading2"/>
       </w:pPr>
       <w:r>
-        <w:t>Highlights</w:t>
+        <w:t>Abstract</w:t>
       </w:r>
     </w:p>
     <w:p>
       <w:pPr>
-        <w:pStyle w:val="ListBullet"/>
+        <w:jc w:val="both"/>
       </w:pPr>
       <w:r>
         <w:rPr>
           <w:rFonts w:ascii="Calibri" w:hAnsi="Calibri"/>
           <w:sz w:val="22"/>
         </w:rPr>
-        <w:t>Bora converts coarse, multi-label tissue masks into full-resolution pixel masks.</w:t>
+        <w:t>Tile-wise tissue classification scales to gigapixel histology but replaces irregular biological interfaces with a block grid. We developed Bora, a boundary-constrained framework that expands categorical tile grids to native resolution and refines only their uncertain borders while preserving label cores. Bora combines deterministic annealed multiclass competition with marker-controlled watershed, writes pyramidal OME-TIFF and GeoJSON outputs, and supports MedSAM or PathSegmentor as optional refinement engines. We evaluated the default chain in a controlled reconstruction benchmark spanning six human Visium HD tissue images, 11.46 billion pixels and 37 foreground classes. Pixel-level masks rasterized directly from the original GeoJSON annotations served as references; 56-pixel majority-vote grids were the only label input to Bora. Refinement improved binary foreground Dice in all six tissues (mean change, +0.00042) but reduced pixel accuracy in all six (mean, -0.00153), macro Dice in five of six (mean, -0.00740) and macro intersection-over-union in five of six (mean, -0.01160). Rare classes were disproportionately affected. These results reveal a central limitation of image-driven post-processing: histological edges can recover tissue extent yet need not coincide with semantic boundaries inherited from molecular or regional annotations. Bora therefore provides both a scalable implementation and an auditable test bed for conservative refinement. The findings motivate separate treatment of tissue-background and inter-class interfaces, confidence-gated updates and class-adaptive displacement constraints.</w:t>
       </w:r>
     </w:p>
     <w:p>
       <w:pPr>
-        <w:pStyle w:val="ListBullet"/>
+        <w:jc w:val="both"/>
       </w:pPr>
       <w:r>
         <w:rPr>
           <w:rFonts w:ascii="Calibri" w:hAnsi="Calibri"/>
           <w:sz w:val="22"/>
         </w:rPr>
-        <w:t>Refinement is confined to an editable boundary band while label cores are protected.</w:t>
-      </w:r>
-    </w:p>
-    <w:p>
-      <w:pPr>
-        <w:pStyle w:val="ListBullet"/>
-      </w:pPr>
-      <w:r>
-        <w:rPr>
-          <w:rFonts w:ascii="Calibri" w:hAnsi="Calibri"/>
-          <w:sz w:val="22"/>
-        </w:rPr>
-        <w:t>Overlapping border tiles enable processing independent of the number of input labels.</w:t>
-      </w:r>
-    </w:p>
-    <w:p>
-      <w:pPr>
-        <w:pStyle w:val="ListBullet"/>
-      </w:pPr>
-      <w:r>
-        <w:rPr>
-          <w:rFonts w:ascii="Calibri" w:hAnsi="Calibri"/>
-          <w:sz w:val="22"/>
-        </w:rPr>
-        <w:t>Annealed label competition and native-resolution watershed refine boundaries sequentially.</w:t>
-      </w:r>
-    </w:p>
-    <w:p>
-      <w:pPr>
-        <w:pStyle w:val="ListBullet"/>
-      </w:pPr>
-      <w:r>
-        <w:rPr>
-          <w:rFonts w:ascii="Calibri" w:hAnsi="Calibri"/>
-          <w:sz w:val="22"/>
-        </w:rPr>
-        <w:t>Raster OME-TIFF and vector GeoJSON outputs support interoperable downstream analysis.</w:t>
-      </w:r>
-    </w:p>
-    <w:p>
-      <w:pPr>
-        <w:pStyle w:val="Heading2"/>
-      </w:pPr>
-      <w:r>
-        <w:t>Abstract</w:t>
-      </w:r>
-    </w:p>
-    <w:p>
-      <w:pPr>
-        <w:jc w:val="both"/>
-      </w:pPr>
-      <w:r>
-        <w:rPr>
-          <w:rFonts w:ascii="Calibri" w:hAnsi="Calibri"/>
-          <w:sz w:val="22"/>
-        </w:rPr>
-        <w:t>Tile-level classifiers are computationally attractive for gigapixel histopathology, but their block-like boundaries can distort morphometry, spatial relationships, and downstream region-based analysis. We present Bora, a boundary-constrained algorithm that converts a labelled tile-level mask into a full-resolution pixel-level tissue segmentation. Bora accepts a tissue image in pyramidal OME-TIFF format and a spatially aligned TIFF label mask containing an arbitrary number of segment identifiers. Its refinement chain first applies deterministic annealed-wand competition: a bounded multiclass Potts model operating only near interfaces between foreground labels. It then applies marker-controlled watershed on the native-resolution image gradient while preserving eroded label cores. MedSAM can provide a subsequent box-prompted refinement stage; PathSegmentor is reserved for experiments with an explicit label-to-text mapping. Overlapping predictions are reconciled by confidence, followed by topology-conscious cleanup and restoration of protected cores. Outputs comprise a tiled, losslessly compressed pyramidal OME-TIFF label map and a coordinate-matched GeoJSON representation.</w:t>
-      </w:r>
-    </w:p>
-    <w:p>
-      <w:pPr>
-        <w:jc w:val="both"/>
-      </w:pPr>
-      <w:r>
-        <w:rPr>
-          <w:rFonts w:ascii="Calibri" w:hAnsi="Calibri"/>
-          <w:sz w:val="22"/>
-        </w:rPr>
-        <w:t xml:space="preserve">We will evaluate Bora on </w:t>
-      </w:r>
-      <w:r>
-        <w:rPr>
-          <w:rFonts w:ascii="Calibri" w:hAnsi="Calibri"/>
-          <w:b/>
-          <w:color w:val="9C5C00"/>
-          <w:sz w:val="22"/>
-          <w:highlight w:val="yellow"/>
-        </w:rPr>
-        <w:t>[NUMBER]</w:t>
-      </w:r>
-      <w:r>
-        <w:rPr>
-          <w:rFonts w:ascii="Calibri" w:hAnsi="Calibri"/>
-          <w:sz w:val="22"/>
-        </w:rPr>
-        <w:t xml:space="preserve"> slides from </w:t>
-      </w:r>
-      <w:r>
-        <w:rPr>
-          <w:rFonts w:ascii="Calibri" w:hAnsi="Calibri"/>
-          <w:b/>
-          <w:color w:val="9C5C00"/>
-          <w:sz w:val="22"/>
-          <w:highlight w:val="yellow"/>
-        </w:rPr>
-        <w:t>[COHORTS, ORGANS, STAINS AND INSTITUTIONS]</w:t>
-      </w:r>
-      <w:r>
-        <w:rPr>
-          <w:rFonts w:ascii="Calibri" w:hAnsi="Calibri"/>
-          <w:sz w:val="22"/>
-        </w:rPr>
-        <w:t xml:space="preserve">, using pixel-level expert annotations created under </w:t>
-      </w:r>
-      <w:r>
-        <w:rPr>
-          <w:rFonts w:ascii="Calibri" w:hAnsi="Calibri"/>
-          <w:b/>
-          <w:color w:val="9C5C00"/>
-          <w:sz w:val="22"/>
-          <w:highlight w:val="yellow"/>
-        </w:rPr>
-        <w:t>[ANNOTATION PROTOCOL]</w:t>
-      </w:r>
-      <w:r>
-        <w:rPr>
-          <w:rFonts w:ascii="Calibri" w:hAnsi="Calibri"/>
-          <w:sz w:val="22"/>
-        </w:rPr>
-        <w:t>. Primary endpoints are boundary intersection-over-union and normalized surface Dice; secondary endpoints include Dice similarity coefficient, 95th-percentile Hausdorff distance, label retention, topology errors, runtime, and peak memory. Comparisons will include the unrefined tile mask, annealed-wand competition alone, native watershed alone, their sequential combination, and the combination followed by MedSAM or PathSegmentor. No performance results are reported in this draft because the benchmark has not yet been run.</w:t>
-      </w:r>
-    </w:p>
-    <w:p>
-      <w:pPr>
-        <w:jc w:val="both"/>
-      </w:pPr>
-      <w:r>
-        <w:rPr>
-          <w:rFonts w:ascii="Calibri" w:hAnsi="Calibri"/>
-          <w:sz w:val="22"/>
-        </w:rPr>
-        <w:t>Keywords: computational pathology; semantic segmentation; boundary refinement; whole-slide imaging; MedSAM; PathSegmentor; OME-TIFF; GeoJSON</w:t>
+        <w:t>Keywords: computational pathology; semantic segmentation; boundary refinement; whole-slide imaging; spatial transcriptomics; OME-TIFF; GeoJSON</w:t>
       </w:r>
     </w:p>
     <w:p>
@@ -352,7 +221,7 @@
           <w:rFonts w:ascii="Calibri" w:hAnsi="Calibri"/>
           <w:sz w:val="22"/>
         </w:rPr>
-        <w:t>The intended contributions are:</w:t>
+        <w:t>The contributions of this work are:</w:t>
       </w:r>
     </w:p>
     <w:p>
@@ -416,7 +285,7 @@
           <w:rFonts w:ascii="Calibri" w:hAnsi="Calibri"/>
           <w:sz w:val="22"/>
         </w:rPr>
-        <w:t>an evaluation protocol emphasizing boundary fidelity, failure safety, computational cost, and whole-slide interoperability.</w:t>
+        <w:t>a controlled, whole-slide benchmark that exposes a reproducible trade-off between foreground recovery and multiclass semantic preservation.</w:t>
       </w:r>
     </w:p>
     <w:p>
@@ -424,7 +293,7 @@
         <w:pStyle w:val="Heading2"/>
       </w:pPr>
       <w:r>
-        <w:t>2. Materials and methods</w:t>
+        <w:t>2. Results</w:t>
       </w:r>
     </w:p>
     <w:p>
@@ -432,7 +301,7 @@
         <w:pStyle w:val="Heading3"/>
       </w:pPr>
       <w:r>
-        <w:t>2.1 Study design and data</w:t>
+        <w:t>2.1 A controlled reconstruction benchmark across 11.46 billion pixels</w:t>
       </w:r>
     </w:p>
     <w:p>
@@ -444,92 +313,91 @@
           <w:rFonts w:ascii="Calibri" w:hAnsi="Calibri"/>
           <w:sz w:val="22"/>
         </w:rPr>
-        <w:t xml:space="preserve">This study will use </w:t>
+        <w:t>We assembled six human Visium HD tissue images representing pancreas, tissue-array, lymph-node, tonsil, colon-cancer and lung-cancer specimens. Images ranged from 1.22 to 3.53 gigapixels and together comprised 11.46 billion native-resolution pixels. For each specimen, the original class-labelled GeoJSON was rasterized at native resolution to form the reference. Majority voting in non-overlapping 56 × 56-pixel tiles then produced the deliberately quantized categorical input. This design isolates the information lost through tiling: the reference and coarse masks share an ontology and coordinate system, and no registration or class-remapping error is introduced.</w:t>
       </w:r>
-      <w:r>
-        <w:rPr>
-          <w:rFonts w:ascii="Calibri" w:hAnsi="Calibri"/>
-          <w:b/>
-          <w:color w:val="9C5C00"/>
-          <w:sz w:val="22"/>
-          <w:highlight w:val="yellow"/>
-        </w:rPr>
-        <w:t>[RETROSPECTIVE/PROSPECTIVE]</w:t>
-      </w:r>
+    </w:p>
+    <w:p>
+      <w:pPr>
+        <w:jc w:val="both"/>
+      </w:pPr>
       <w:r>
         <w:rPr>
           <w:rFonts w:ascii="Calibri" w:hAnsi="Calibri"/>
           <w:sz w:val="22"/>
         </w:rPr>
-        <w:t xml:space="preserve"> digitized tissue specimens from </w:t>
+        <w:t>The benchmark is a reconstruction experiment, not an independent clinical-validation cohort. The reference geometries were not newly traced by pathologists and the six images should not be interpreted as independent patient-level evidence. Their role is to stress-test whether image-driven refinement can reverse a known tiling transformation at whole-slide scale.</w:t>
       </w:r>
+    </w:p>
+    <w:p>
+      <w:pPr>
+        <w:pStyle w:val="Heading3"/>
+      </w:pPr>
       <w:r>
-        <w:rPr>
-          <w:rFonts w:ascii="Calibri" w:hAnsi="Calibri"/>
-          <w:b/>
-          <w:color w:val="9C5C00"/>
-          <w:sz w:val="22"/>
-          <w:highlight w:val="yellow"/>
-        </w:rPr>
-        <w:t>[INSTITUTIONS]</w:t>
+        <w:t>2.2 Refinement consistently improves foreground extent but not semantic overlap</w:t>
       </w:r>
+    </w:p>
+    <w:p>
+      <w:pPr>
+        <w:jc w:val="both"/>
+      </w:pPr>
       <w:r>
         <w:rPr>
           <w:rFonts w:ascii="Calibri" w:hAnsi="Calibri"/>
           <w:sz w:val="22"/>
         </w:rPr>
-        <w:t xml:space="preserve">. The development, internal test, and external test cohorts will contain </w:t>
+        <w:t>All six specimens completed the full reference comparison. The unrefined majority-vote masks already achieved pixel accuracies from 0.9721 to 0.9937. Bora increased binary foreground Dice in every specimen, with changes from +0.00005 to +0.00089 (mean, +0.00042). This consistent direction indicates that image-supported refinement better aligned the union of all tissue classes with the foreground footprint.</w:t>
       </w:r>
-      <w:r>
-        <w:rPr>
-          <w:rFonts w:ascii="Calibri" w:hAnsi="Calibri"/>
-          <w:b/>
-          <w:color w:val="9C5C00"/>
-          <w:sz w:val="22"/>
-          <w:highlight w:val="yellow"/>
-        </w:rPr>
-        <w:t>[N]</w:t>
-      </w:r>
+    </w:p>
+    <w:p>
+      <w:pPr>
+        <w:jc w:val="both"/>
+      </w:pPr>
       <w:r>
         <w:rPr>
           <w:rFonts w:ascii="Calibri" w:hAnsi="Calibri"/>
           <w:sz w:val="22"/>
         </w:rPr>
-        <w:t xml:space="preserve">, </w:t>
+        <w:t>The same updates were detrimental when label identity was considered. Pixel accuracy decreased in every specimen (mean change, -0.00153), as did micro Dice (mean, -0.00296). Macro Dice decreased in five of six specimens (mean, -0.00740), and macro IoU decreased in five of six (mean, -0.01160). Colon cancer showed the largest loss in macro IoU (-0.01864), closely followed by lung cancer (-0.01855), while pancreas was the only specimen with a small macro-IoU improvement (+0.00059). Thus, an improvement in the binary tissue outline did not imply improved multiclass segmentation.</w:t>
       </w:r>
+    </w:p>
+    <w:p>
+      <w:pPr>
+        <w:pStyle w:val="Heading3"/>
+      </w:pPr>
       <w:r>
-        <w:rPr>
-          <w:rFonts w:ascii="Calibri" w:hAnsi="Calibri"/>
-          <w:b/>
-          <w:color w:val="9C5C00"/>
-          <w:sz w:val="22"/>
-          <w:highlight w:val="yellow"/>
-        </w:rPr>
-        <w:t>[N]</w:t>
+        <w:t>2.3 Small semantic regions are vulnerable to boundary competition</w:t>
       </w:r>
+    </w:p>
+    <w:p>
+      <w:pPr>
+        <w:jc w:val="both"/>
+      </w:pPr>
       <w:r>
         <w:rPr>
           <w:rFonts w:ascii="Calibri" w:hAnsi="Calibri"/>
           <w:sz w:val="22"/>
         </w:rPr>
-        <w:t xml:space="preserve">, and </w:t>
+        <w:t>The largest class-specific errors occurred in relatively small regions. In colon cancer, a class supported by 5.33 million reference pixels had an IoU of 0.6304 after refinement; in lung cancer, a 17.76-million-pixel class reached 0.6496; in tonsil, a 2.64-million-pixel class reached 0.7255; and in lymph node, a 6.56-million-pixel class reached 0.6963. These failures were dominated by false-positive expansion into adjacent classes rather than complete disappearance. Large foreground compartments, by contrast, retained high overlap and dominated the binary foreground score.</w:t>
       </w:r>
-      <w:r>
-        <w:rPr>
-          <w:rFonts w:ascii="Calibri" w:hAnsi="Calibri"/>
-          <w:b/>
-          <w:color w:val="9C5C00"/>
-          <w:sz w:val="22"/>
-          <w:highlight w:val="yellow"/>
-        </w:rPr>
-        <w:t>[N]</w:t>
-      </w:r>
+    </w:p>
+    <w:p>
+      <w:pPr>
+        <w:jc w:val="both"/>
+      </w:pPr>
       <w:r>
         <w:rPr>
           <w:rFonts w:ascii="Calibri" w:hAnsi="Calibri"/>
           <w:sz w:val="22"/>
         </w:rPr>
-        <w:t xml:space="preserve"> slides, respectively. Include a patient-level flow diagram reporting exclusions, scanner models, objective magnification, micrometres per pixel, tissue sites, stains, diagnoses, and class prevalence. Splits must be performed at patient level; slides or tiles from one patient must not cross splits. If parameters are selected on a validation set, the test set must remain locked until final analysis.</w:t>
+        <w:t>This size dependence follows from symmetric boundary motion: a displacement of fixed width represents a much larger fraction of a small region than of a large one. It also exposes a limitation in the default confidence arbitration, which does not calibrate its acceptance threshold by class prevalence or component geometry.</w:t>
+      </w:r>
+    </w:p>
+    <w:p>
+      <w:pPr>
+        <w:pStyle w:val="Heading3"/>
+      </w:pPr>
+      <w:r>
+        <w:t>2.4 Whole-slide execution is feasible but computationally intensive</w:t>
       </w:r>
     </w:p>
     <w:p>
@@ -541,129 +409,99 @@
           <w:rFonts w:ascii="Calibri" w:hAnsi="Calibri"/>
           <w:sz w:val="22"/>
         </w:rPr>
-        <w:t xml:space="preserve">The reference annotation protocol is </w:t>
+        <w:t>The default native-resolution chain processed all six images using memory-bounded 2,048-pixel blocks. Depending on image area and boundary density, 174-632 blocks per specimen required refinement, while homogeneous blocks were copied unchanged. Refinement time ranged from 5,314 to 29,169 seconds per image and totalled 64,421 seconds (17.9 h). The slowest tissue-array image was both the largest specimen and the one with the largest editable workload. GeoJSON conversion required 17-73 seconds per specimen and emitted one top-level feature per foreground label while retaining disconnected polygon parts.</w:t>
       </w:r>
-      <w:r>
-        <w:rPr>
-          <w:rFonts w:ascii="Calibri" w:hAnsi="Calibri"/>
-          <w:b/>
-          <w:color w:val="9C5C00"/>
-          <w:sz w:val="22"/>
-          <w:highlight w:val="yellow"/>
-        </w:rPr>
-        <w:t>[DETAILS]</w:t>
-      </w:r>
+    </w:p>
+    <w:p>
+      <w:pPr>
+        <w:jc w:val="both"/>
+      </w:pPr>
       <w:r>
         <w:rPr>
           <w:rFonts w:ascii="Calibri" w:hAnsi="Calibri"/>
           <w:sz w:val="22"/>
         </w:rPr>
-        <w:t xml:space="preserve">. At least </w:t>
+        <w:t>The tiling-mask C++ stage was substantially faster than refinement; for the 1.53-gigapixel pancreas image it rasterized the reference and generated the tile grid in 7.56 seconds. These measurements show that bounded-memory processing makes gigapixel execution possible, but the present watershed implementation remains the dominant computational cost.</w:t>
       </w:r>
+    </w:p>
+    <w:p>
+      <w:pPr>
+        <w:pStyle w:val="Heading3"/>
+      </w:pPr>
       <w:r>
-        <w:rPr>
-          <w:rFonts w:ascii="Calibri" w:hAnsi="Calibri"/>
-          <w:b/>
-          <w:color w:val="9C5C00"/>
-          <w:sz w:val="22"/>
-          <w:highlight w:val="yellow"/>
-        </w:rPr>
-        <w:t>[N]</w:t>
+        <w:t>2.5 The observed failure mode motivates conservative refinement</w:t>
       </w:r>
+    </w:p>
+    <w:p>
+      <w:pPr>
+        <w:jc w:val="both"/>
+      </w:pPr>
       <w:r>
         <w:rPr>
           <w:rFonts w:ascii="Calibri" w:hAnsi="Calibri"/>
           <w:sz w:val="22"/>
         </w:rPr>
-        <w:t xml:space="preserve"> pathologists will independently trace </w:t>
+        <w:t>The directionally opposed binary and multiclass results indicate that the default objective is misaligned with the semantic benchmark. Histological gradients provide useful evidence at the boundary between tissue and glass background. Interfaces between transcriptomic clusters or regional annotations, however, may have weak, displaced or absent counterparts in RGB morphology. Allowing the same image-driven rule to move both interface types therefore improves foreground extent while exchanging labels internally.</w:t>
       </w:r>
-      <w:r>
-        <w:rPr>
-          <w:rFonts w:ascii="Calibri" w:hAnsi="Calibri"/>
-          <w:b/>
-          <w:color w:val="9C5C00"/>
-          <w:sz w:val="22"/>
-          <w:highlight w:val="yellow"/>
-        </w:rPr>
-        <w:t>[ALL/STRATIFIED]</w:t>
-      </w:r>
+    </w:p>
+    <w:p>
+      <w:pPr>
+        <w:jc w:val="both"/>
+      </w:pPr>
       <w:r>
         <w:rPr>
           <w:rFonts w:ascii="Calibri" w:hAnsi="Calibri"/>
           <w:sz w:val="22"/>
         </w:rPr>
-        <w:t xml:space="preserve"> boundary regions at full resolution using </w:t>
+        <w:t>These findings define three immediate design requirements: tissue-background and inter-class boundaries should be handled separately; a proposed change should be accepted only when its evidence exceeds a calibrated confidence threshold; and maximum displacement and area change should depend on component size. These are testable algorithmic consequences of the benchmark rather than post hoc explanations of individual images.</w:t>
       </w:r>
+    </w:p>
+    <w:p>
+      <w:pPr>
+        <w:pStyle w:val="Heading2"/>
+      </w:pPr>
       <w:r>
-        <w:rPr>
-          <w:rFonts w:ascii="Calibri" w:hAnsi="Calibri"/>
-          <w:b/>
-          <w:color w:val="9C5C00"/>
-          <w:sz w:val="22"/>
-          <w:highlight w:val="yellow"/>
-        </w:rPr>
-        <w:t>[SOFTWARE]</w:t>
+        <w:t>3. Methods</w:t>
       </w:r>
+    </w:p>
+    <w:p>
+      <w:pPr>
+        <w:pStyle w:val="Heading3"/>
+      </w:pPr>
+      <w:r>
+        <w:t>3.1 Study design and data</w:t>
+      </w:r>
+    </w:p>
+    <w:p>
+      <w:pPr>
+        <w:jc w:val="both"/>
+      </w:pPr>
       <w:r>
         <w:rPr>
           <w:rFonts w:ascii="Calibri" w:hAnsi="Calibri"/>
           <w:sz w:val="22"/>
         </w:rPr>
-        <w:t xml:space="preserve">. Disagreement will be resolved by </w:t>
+        <w:t>We performed a controlled degradation-and-reconstruction study using six human tissue images and their matched class-labelled GeoJSON files. Each GeoJSON was rasterized by tiling-mask-cpp in image-pixel coordinates. The resulting native mask was retained unchanged as the reference. A categorical tile grid was produced by majority vote over 56 × 56-pixel regions, with background participating in the vote and deterministic lowest-ID tie breaking. The grid was expanded back to native dimensions by nearest-neighbour repetition and supplied to Bora together with the original image. The reference mask was never supplied to the refinement algorithm.</w:t>
       </w:r>
-      <w:r>
-        <w:rPr>
-          <w:rFonts w:ascii="Calibri" w:hAnsi="Calibri"/>
-          <w:b/>
-          <w:color w:val="9C5C00"/>
-          <w:sz w:val="22"/>
-          <w:highlight w:val="yellow"/>
-        </w:rPr>
-        <w:t>[CONSENSUS/ADJUDICATION]</w:t>
-      </w:r>
+    </w:p>
+    <w:p>
+      <w:pPr>
+        <w:jc w:val="both"/>
+      </w:pPr>
       <w:r>
         <w:rPr>
           <w:rFonts w:ascii="Calibri" w:hAnsi="Calibri"/>
           <w:sz w:val="22"/>
         </w:rPr>
-        <w:t xml:space="preserve">. Report annotator expertise, blinding, annotation zoom, and whether coarse input masks were hidden. A subset of </w:t>
-      </w:r>
-      <w:r>
-        <w:rPr>
-          <w:rFonts w:ascii="Calibri" w:hAnsi="Calibri"/>
-          <w:b/>
-          <w:color w:val="9C5C00"/>
-          <w:sz w:val="22"/>
-          <w:highlight w:val="yellow"/>
-        </w:rPr>
-        <w:t>[N]</w:t>
-      </w:r>
-      <w:r>
-        <w:rPr>
-          <w:rFonts w:ascii="Calibri" w:hAnsi="Calibri"/>
-          <w:sz w:val="22"/>
-        </w:rPr>
-        <w:t xml:space="preserve"> slides will be re-annotated to quantify inter- and intra-observer variability.</w:t>
+        <w:t>The tissues were pancreas (33,007 × 46,391 pixels), tissue array (79,157 × 44,649), lymph node (30,966 × 39,421), tonsil (29,473 × 41,910), colon cancer (53,020 × 43,603) and lung cancer (54,639 × 29,814). Together they contained 11.46 billion pixels. Labels were mutually exclusive categorical regions with zero reserved for background. This technical benchmark uses existing computational annotations and does not establish diagnostic performance or inter-observer agreement.</w:t>
       </w:r>
     </w:p>
     <w:p>
       <w:pPr>
-        <w:jc w:val="both"/>
+        <w:pStyle w:val="Heading3"/>
       </w:pPr>
       <w:r>
-        <w:rPr>
-          <w:rFonts w:ascii="Calibri" w:hAnsi="Calibri"/>
-          <w:sz w:val="22"/>
-        </w:rPr>
-        <w:t>Required before submission: populate a dataset table; provide a class ontology; document whether labels denote mutually exclusive tissue classes or distinct instances; and explain how holes, disconnected components, touching labels, and uncertain regions are represented.</w:t>
-      </w:r>
-    </w:p>
-    <w:p>
-      <w:pPr>
-        <w:pStyle w:val="Heading3"/>
-      </w:pPr>
-      <w:r>
-        <w:t>2.2 Inputs and coordinate model</w:t>
+        <w:t>3.2 Inputs and coordinate model</w:t>
       </w:r>
     </w:p>
     <w:p>
@@ -695,7 +533,7 @@
         <w:pStyle w:val="Heading3"/>
       </w:pPr>
       <w:r>
-        <w:t>2.3 Overview of Bora</w:t>
+        <w:t>3.3 Overview of Bora</w:t>
       </w:r>
     </w:p>
     <w:p>
@@ -855,7 +693,7 @@
         <w:pStyle w:val="Heading3"/>
       </w:pPr>
       <w:r>
-        <w:t>2.4 Protected cores and editable boundary bands</w:t>
+        <w:t>3.4 Protected cores and editable boundary bands</w:t>
       </w:r>
     </w:p>
     <w:p>
@@ -893,61 +731,27 @@
           <w:rFonts w:ascii="Calibri" w:hAnsi="Calibri"/>
           <w:sz w:val="22"/>
         </w:rPr>
-        <w:t xml:space="preserve">where Q_k is an optional trusted seed region, r_c is the core erosion radius, and r_o is the outward search radius. The editable band is initially B_k=E_k minus  C_k. If erosion removes a small component completely, its trusted seeds or original component are retained according to </w:t>
+        <w:t>where Q_k is an optional trusted seed region, r_c is the core erosion radius, and r_o is the outward search radius. The editable band is initially B_k=E_k minus  C_k. If erosion removes a component completely, its original support becomes the core so that the label cannot disappear solely because it is smaller than the erosion diameter. The present benchmark used pixel radii because harmonized physical calibration was not available; calibrated studies should specify these quantities in micrometres.</w:t>
       </w:r>
-      <w:r>
-        <w:rPr>
-          <w:rFonts w:ascii="Calibri" w:hAnsi="Calibri"/>
-          <w:b/>
-          <w:color w:val="9C5C00"/>
-          <w:sz w:val="22"/>
-          <w:highlight w:val="yellow"/>
-        </w:rPr>
-        <w:t>[SMALL-COMPONENT POLICY]</w:t>
-      </w:r>
+    </w:p>
+    <w:p>
+      <w:pPr>
+        <w:jc w:val="both"/>
+      </w:pPr>
       <w:r>
         <w:rPr>
           <w:rFonts w:ascii="Calibri" w:hAnsi="Calibri"/>
           <w:sz w:val="22"/>
         </w:rPr>
-        <w:t>. Radii are specified in micrometres and converted to pixels using OME metadata; pixel defaults are allowed only when calibration is absent and must be reported.</w:t>
+        <w:t>For very large masks, Bora streams haloed blocks and performs final constraint enforcement at full resolution. Homogeneous blocks are copied without refinement. The halo equals the largest active morphology or competition radius plus four pixels, preventing ordinary boundary operations from being clipped at block edges.</w:t>
       </w:r>
     </w:p>
     <w:p>
       <w:pPr>
-        <w:jc w:val="both"/>
+        <w:pStyle w:val="Heading3"/>
       </w:pPr>
       <w:r>
-        <w:rPr>
-          <w:rFonts w:ascii="Calibri" w:hAnsi="Calibri"/>
-          <w:sz w:val="22"/>
-        </w:rPr>
-        <w:t xml:space="preserve">For very large masks, distance transforms and morphology may be computed at a controlled downsampling factor before conservative upsampling. Full-resolution morphology is used for final constraint enforcement. White-background exclusion is estimated by </w:t>
-      </w:r>
-      <w:r>
-        <w:rPr>
-          <w:rFonts w:ascii="Calibri" w:hAnsi="Calibri"/>
-          <w:b/>
-          <w:color w:val="9C5C00"/>
-          <w:sz w:val="22"/>
-          <w:highlight w:val="yellow"/>
-        </w:rPr>
-        <w:t>[METHOD AND THRESHOLD]</w:t>
-      </w:r>
-      <w:r>
-        <w:rPr>
-          <w:rFonts w:ascii="Calibri" w:hAnsi="Calibri"/>
-          <w:sz w:val="22"/>
-        </w:rPr>
-        <w:t>, but never overrides protected cores or trusted seeds.</w:t>
-      </w:r>
-    </w:p>
-    <w:p>
-      <w:pPr>
-        <w:pStyle w:val="Heading3"/>
-      </w:pPr>
-      <w:r>
-        <w:t>2.5 Annealed-wand boundary competition</w:t>
+        <w:t>3.5 Annealed-wand boundary competition</w:t>
       </w:r>
     </w:p>
     <w:p>
@@ -1019,7 +823,7 @@
         <w:pStyle w:val="Heading3"/>
       </w:pPr>
       <w:r>
-        <w:t>2.6 Native-resolution watershed</w:t>
+        <w:t>3.6 Native-resolution watershed</w:t>
       </w:r>
     </w:p>
     <w:p>
@@ -1039,7 +843,7 @@
         <w:pStyle w:val="Heading3"/>
       </w:pPr>
       <w:r>
-        <w:t>2.7 Border tiling and prompts</w:t>
+        <w:t>3.7 Border tiling and prompts</w:t>
       </w:r>
     </w:p>
     <w:p>
@@ -1051,104 +855,19 @@
           <w:rFonts w:ascii="Calibri" w:hAnsi="Calibri"/>
           <w:sz w:val="22"/>
         </w:rPr>
-        <w:t xml:space="preserve">For each label, connected border regions are covered by square tiles of </w:t>
+        <w:t>For each label, connected border regions are covered by 2,048-pixel square tiles with 256 pixels of overlap. Tiles containing no editable pixels are skipped. Border-aware scheduling is deterministic. At image margins, arrays are cropped to their valid extent rather than padded.</w:t>
       </w:r>
-      <w:r>
-        <w:rPr>
-          <w:rFonts w:ascii="Calibri" w:hAnsi="Calibri"/>
-          <w:b/>
-          <w:color w:val="9C5C00"/>
-          <w:sz w:val="22"/>
-          <w:highlight w:val="yellow"/>
-        </w:rPr>
-        <w:t>[TILE SIZE]</w:t>
-      </w:r>
+    </w:p>
+    <w:p>
+      <w:pPr>
+        <w:jc w:val="both"/>
+      </w:pPr>
       <w:r>
         <w:rPr>
           <w:rFonts w:ascii="Calibri" w:hAnsi="Calibri"/>
           <w:sz w:val="22"/>
         </w:rPr>
-        <w:t xml:space="preserve"> pixels with </w:t>
-      </w:r>
-      <w:r>
-        <w:rPr>
-          <w:rFonts w:ascii="Calibri" w:hAnsi="Calibri"/>
-          <w:b/>
-          <w:color w:val="9C5C00"/>
-          <w:sz w:val="22"/>
-          <w:highlight w:val="yellow"/>
-        </w:rPr>
-        <w:t>[OVERLAP]</w:t>
-      </w:r>
-      <w:r>
-        <w:rPr>
-          <w:rFonts w:ascii="Calibri" w:hAnsi="Calibri"/>
-          <w:sz w:val="22"/>
-        </w:rPr>
-        <w:t xml:space="preserve"> pixels of overlap. Tiles containing no editable pixels are skipped. Border-aware scheduling is deterministic, and tile coordinates are saved for reproducibility and restart. Padding uses </w:t>
-      </w:r>
-      <w:r>
-        <w:rPr>
-          <w:rFonts w:ascii="Calibri" w:hAnsi="Calibri"/>
-          <w:b/>
-          <w:color w:val="9C5C00"/>
-          <w:sz w:val="22"/>
-          <w:highlight w:val="yellow"/>
-        </w:rPr>
-        <w:t>[REFLECT/CONSTANT]</w:t>
-      </w:r>
-      <w:r>
-        <w:rPr>
-          <w:rFonts w:ascii="Calibri" w:hAnsi="Calibri"/>
-          <w:sz w:val="22"/>
-        </w:rPr>
-        <w:t xml:space="preserve"> mode and predictions are cropped back to the valid image extent.</w:t>
-      </w:r>
-    </w:p>
-    <w:p>
-      <w:pPr>
-        <w:jc w:val="both"/>
-      </w:pPr>
-      <w:r>
-        <w:rPr>
-          <w:rFonts w:ascii="Calibri" w:hAnsi="Calibri"/>
-          <w:sz w:val="22"/>
-        </w:rPr>
-        <w:t xml:space="preserve">For MedSAM, each coarse connected component inside a tile is converted to a bounding-box prompt expanded by </w:t>
-      </w:r>
-      <w:r>
-        <w:rPr>
-          <w:rFonts w:ascii="Calibri" w:hAnsi="Calibri"/>
-          <w:b/>
-          <w:color w:val="9C5C00"/>
-          <w:sz w:val="22"/>
-          <w:highlight w:val="yellow"/>
-        </w:rPr>
-        <w:t>[MARGIN]</w:t>
-      </w:r>
-      <w:r>
-        <w:rPr>
-          <w:rFonts w:ascii="Calibri" w:hAnsi="Calibri"/>
-          <w:sz w:val="22"/>
-        </w:rPr>
-        <w:t xml:space="preserve"> pixels and clipped to the tile. </w:t>
-      </w:r>
-      <w:r>
-        <w:rPr>
-          <w:rFonts w:ascii="Calibri" w:hAnsi="Calibri"/>
-          <w:b/>
-          <w:color w:val="9C5C00"/>
-          <w:sz w:val="22"/>
-          <w:highlight w:val="yellow"/>
-        </w:rPr>
-        <w:t>[POSITIVE/NEGATIVE POINT]</w:t>
-      </w:r>
-      <w:r>
-        <w:rPr>
-          <w:rFonts w:ascii="Calibri" w:hAnsi="Calibri"/>
-          <w:sz w:val="22"/>
-        </w:rPr>
-        <w:t xml:space="preserve"> prompts derived from the protected core and neighbouring labels are used if supported by the selected implementation. RGB conversion, intensity normalization, resizing, and restoration to native resolution follow the published MedSAM preprocessing [4] and are recorded in the run manifest.</w:t>
+        <w:t>For MedSAM, each coarse connected component inside a tile is converted to a bounding-box prompt expanded by four pixels and clipped to the tile. RGB conversion, intensity normalization, resizing, and restoration to native resolution follow the published MedSAM preprocessing [4] and are recorded in the run manifest. MedSAM was not activated in the benchmark reported here.</w:t>
       </w:r>
     </w:p>
     <w:p>
@@ -1168,7 +887,7 @@
         <w:pStyle w:val="Heading3"/>
       </w:pPr>
       <w:r>
-        <w:t>2.8 Fusion and label preservation</w:t>
+        <w:t>3.8 Fusion and label preservation</w:t>
       </w:r>
     </w:p>
     <w:p>
@@ -1180,24 +899,7 @@
           <w:rFonts w:ascii="Calibri" w:hAnsi="Calibri"/>
           <w:sz w:val="22"/>
         </w:rPr>
-        <w:t xml:space="preserve">Each backend prediction is masked by E_k and scored within tilde B_k. Overlapping tiles for one label are blended using </w:t>
-      </w:r>
-      <w:r>
-        <w:rPr>
-          <w:rFonts w:ascii="Calibri" w:hAnsi="Calibri"/>
-          <w:b/>
-          <w:color w:val="9C5C00"/>
-          <w:sz w:val="22"/>
-          <w:highlight w:val="yellow"/>
-        </w:rPr>
-        <w:t>[WEIGHTED WINDOW/MAX/MEAN]</w:t>
-      </w:r>
-      <w:r>
-        <w:rPr>
-          <w:rFonts w:ascii="Calibri" w:hAnsi="Calibri"/>
-          <w:sz w:val="22"/>
-        </w:rPr>
-        <w:t xml:space="preserve"> fusion. At pixels proposed by multiple labels, the winner is</w:t>
+        <w:t>Each backend prediction is masked by E_k and scored within tilde B_k. Overlapping tiles retain the proposal with maximum confidence. At pixels proposed by multiple labels, the winner is</w:t>
       </w:r>
     </w:p>
     <w:p>
@@ -1211,7 +913,7 @@
           <w:i/>
           <w:sz w:val="20"/>
         </w:rPr>
-        <w:t xml:space="preserve"> L^(x)=argmax_kp_k(x)+lambda,q_k(x), </w:t>
+        <w:t xml:space="preserve"> L^(x)=argmax_k p_k(x), </w:t>
       </w:r>
     </w:p>
     <w:p>
@@ -1223,115 +925,47 @@
           <w:rFonts w:ascii="Calibri" w:hAnsi="Calibri"/>
           <w:sz w:val="22"/>
         </w:rPr>
-        <w:t xml:space="preserve">where p_k is model confidence and q_k is a coarse-prior term based on distance to S_k. Ties are resolved deterministically by </w:t>
+        <w:t>where p_k is backend confidence after masking by the label-specific envelope. Strict greater-than comparison leaves the earlier deterministic label assignment unchanged on exact confidence ties. Protected-core assignments override model predictions. The benchmark used a 32-pixel minimum-area threshold and binary closing with a two-pixel disk. Only components connected to their input support are retained, and cleanup never merges two identifiers.</w:t>
       </w:r>
+    </w:p>
+    <w:p>
+      <w:pPr>
+        <w:pStyle w:val="Heading3"/>
+      </w:pPr>
       <w:r>
-        <w:rPr>
-          <w:rFonts w:ascii="Calibri" w:hAnsi="Calibri"/>
-          <w:b/>
-          <w:color w:val="9C5C00"/>
-          <w:sz w:val="22"/>
-          <w:highlight w:val="yellow"/>
-        </w:rPr>
-        <w:t>[RULE]</w:t>
+        <w:t>3.9 Raster and vector output</w:t>
       </w:r>
+    </w:p>
+    <w:p>
+      <w:pPr>
+        <w:jc w:val="both"/>
+      </w:pPr>
       <w:r>
         <w:rPr>
           <w:rFonts w:ascii="Calibri" w:hAnsi="Calibri"/>
           <w:sz w:val="22"/>
         </w:rPr>
-        <w:t xml:space="preserve">. Protected-core assignments override model predictions. A final pass removes components below </w:t>
+        <w:t>The primary raster output is [sample]_refined.ome.tif, containing the level-0 integer label map and successively downsampled levels. Bora writes tiled pyramidal OME-TIFF with lossless LZW compression and SIMPLE nearest-neighbour downsampling so categorical label IDs are not interpolated. The companion GeoJSON is generated after pyramid conversion. The retained CellPhenotyper converter (Git blob fd2dd40) is available as a reference backend. Bora's default four-CPU backend polygonizes a selected categorical pyramid level, filters small components, simplifies the complete polygon coverage jointly so shared class boundaries remain coincident, dissolves components per label in parallel, and maps coordinates to level 0. It emits one top-level feature per observed foreground label while retaining disconnected polygon parts and holes. Prespecified accurate, balanced and fast profiles control pyramid level, area filtering and simplification.</w:t>
       </w:r>
+    </w:p>
+    <w:p>
+      <w:pPr>
+        <w:pStyle w:val="Heading3"/>
+      </w:pPr>
       <w:r>
-        <w:rPr>
-          <w:rFonts w:ascii="Calibri" w:hAnsi="Calibri"/>
-          <w:b/>
-          <w:color w:val="9C5C00"/>
-          <w:sz w:val="22"/>
-          <w:highlight w:val="yellow"/>
-        </w:rPr>
-        <w:t>[AREA]</w:t>
+        <w:t>3.10 Comparators and ablations</w:t>
       </w:r>
+    </w:p>
+    <w:p>
+      <w:pPr>
+        <w:jc w:val="both"/>
+      </w:pPr>
       <w:r>
         <w:rPr>
           <w:rFonts w:ascii="Calibri" w:hAnsi="Calibri"/>
           <w:sz w:val="22"/>
         </w:rPr>
-        <w:t xml:space="preserve">, fills holes below </w:t>
-      </w:r>
-      <w:r>
-        <w:rPr>
-          <w:rFonts w:ascii="Calibri" w:hAnsi="Calibri"/>
-          <w:b/>
-          <w:color w:val="9C5C00"/>
-          <w:sz w:val="22"/>
-          <w:highlight w:val="yellow"/>
-        </w:rPr>
-        <w:t>[AREA]</w:t>
-      </w:r>
-      <w:r>
-        <w:rPr>
-          <w:rFonts w:ascii="Calibri" w:hAnsi="Calibri"/>
-          <w:sz w:val="22"/>
-        </w:rPr>
-        <w:t xml:space="preserve">, smooths contours at radius </w:t>
-      </w:r>
-      <w:r>
-        <w:rPr>
-          <w:rFonts w:ascii="Calibri" w:hAnsi="Calibri"/>
-          <w:b/>
-          <w:color w:val="9C5C00"/>
-          <w:sz w:val="22"/>
-          <w:highlight w:val="yellow"/>
-        </w:rPr>
-        <w:t>[RADIUS]</w:t>
-      </w:r>
-      <w:r>
-        <w:rPr>
-          <w:rFonts w:ascii="Calibri" w:hAnsi="Calibri"/>
-          <w:sz w:val="22"/>
-        </w:rPr>
-        <w:t>, and retains only components connected to their input support or trusted seeds. Cleanup must not merge two identifiers. Every removed, added, and conflicted pixel count is written to a QC summary.</w:t>
-      </w:r>
-    </w:p>
-    <w:p>
-      <w:pPr>
-        <w:pStyle w:val="Heading3"/>
-      </w:pPr>
-      <w:r>
-        <w:t>2.9 Raster and vector output</w:t>
-      </w:r>
-    </w:p>
-    <w:p>
-      <w:pPr>
-        <w:jc w:val="both"/>
-      </w:pPr>
-      <w:r>
-        <w:rPr>
-          <w:rFonts w:ascii="Calibri" w:hAnsi="Calibri"/>
-          <w:sz w:val="22"/>
-        </w:rPr>
-        <w:t>The primary raster output is [sample]_refined.ome.tif, containing the level-0 integer label map and eight successively downsampled levels for the current whole-slide configuration. Bora writes tiled pyramidal OME-TIFF with lossless LZW compression and SIMPLE nearest-neighbour downsampling so categorical label IDs are not interpolated. The companion GeoJSON is generated after pyramid conversion. The retained CellPhenotyper converter (Git blob fd2dd40) is available as a reference backend. Bora's default four-CPU backend polygonizes a selected categorical pyramid level, filters small components, simplifies the complete polygon coverage jointly so shared class boundaries remain coincident, dissolves components per label in parallel, and maps coordinates to level 0. It emits the theoretical minimum of one top-level feature per observed foreground label while retaining disconnected polygon parts and holes required for fidelity. Prespecified accurate, balanced, and fast profiles control pyramid level, area filtering, and simplification. Raster round-trip pixel accuracy, foreground IoU, per-label IoU, polygon parts, vertices, file size, wall time, and peak memory are reported.</w:t>
-      </w:r>
-    </w:p>
-    <w:p>
-      <w:pPr>
-        <w:pStyle w:val="Heading3"/>
-      </w:pPr>
-      <w:r>
-        <w:t>2.10 Comparators and ablations</w:t>
-      </w:r>
-    </w:p>
-    <w:p>
-      <w:pPr>
-        <w:jc w:val="both"/>
-      </w:pPr>
-      <w:r>
-        <w:rPr>
-          <w:rFonts w:ascii="Calibri" w:hAnsi="Calibri"/>
-          <w:sz w:val="22"/>
-        </w:rPr>
-        <w:t>The prespecified comparison is:</w:t>
+        <w:t>The present experiment compares the expanded majority-vote baseline with the default Bora chain (annealed-wand competition followed by native-resolution watershed). The software also supports the following prespecified future ablations and model comparisons:</w:t>
       </w:r>
     </w:p>
     <w:p>
@@ -1439,29 +1073,7 @@
           <w:rFonts w:ascii="Calibri" w:hAnsi="Calibri"/>
           <w:sz w:val="22"/>
         </w:rPr>
-        <w:t>Bora-PathSegmentor; and</w:t>
-      </w:r>
-    </w:p>
-    <w:p>
-      <w:pPr>
-        <w:pStyle w:val="ListBullet"/>
-      </w:pPr>
-      <w:r>
-        <w:rPr>
-          <w:rFonts w:ascii="Calibri" w:hAnsi="Calibri"/>
-          <w:b/>
-          <w:color w:val="9C5C00"/>
-          <w:sz w:val="22"/>
-          <w:highlight w:val="yellow"/>
-        </w:rPr>
-        <w:t>[ADDITIONAL SPECIALIST BASELINE]</w:t>
-      </w:r>
-      <w:r>
-        <w:rPr>
-          <w:rFonts w:ascii="Calibri" w:hAnsi="Calibri"/>
-          <w:sz w:val="22"/>
-        </w:rPr>
-        <w:t>.</w:t>
+        <w:t>Bora-PathSegmentor.</w:t>
       </w:r>
     </w:p>
     <w:p>
@@ -1481,7 +1093,7 @@
         <w:pStyle w:val="Heading3"/>
       </w:pPr>
       <w:r>
-        <w:t>2.11 Endpoints and statistical analysis</w:t>
+        <w:t>3.11 Endpoints and statistical analysis</w:t>
       </w:r>
     </w:p>
     <w:p>
@@ -1493,41 +1105,47 @@
           <w:rFonts w:ascii="Calibri" w:hAnsi="Calibri"/>
           <w:sz w:val="22"/>
         </w:rPr>
-        <w:t xml:space="preserve">The two primary metrics are Boundary IoU at a physical tolerance of </w:t>
+        <w:t>We computed pixel accuracy, binary foreground Dice and IoU, and per-class Dice and IoU by streaming aligned raster windows. Macro metrics assign equal weight to every foreground label; micro metrics pool class-specific true-positive, false-positive and false-negative counts. Background is included in pixel accuracy but excluded from multiclass Dice and IoU. Changes are reported as Bora minus the unrefined expanded tile mask.</w:t>
       </w:r>
-      <w:r>
-        <w:rPr>
-          <w:rFonts w:ascii="Calibri" w:hAnsi="Calibri"/>
-          <w:b/>
-          <w:color w:val="9C5C00"/>
-          <w:sz w:val="22"/>
-          <w:highlight w:val="yellow"/>
-        </w:rPr>
-        <w:t>[D]</w:t>
-      </w:r>
+    </w:p>
+    <w:p>
+      <w:pPr>
+        <w:jc w:val="both"/>
+      </w:pPr>
       <w:r>
         <w:rPr>
           <w:rFonts w:ascii="Calibri" w:hAnsi="Calibri"/>
           <w:sz w:val="22"/>
         </w:rPr>
-        <w:t xml:space="preserve"> µm [1] and normalized surface Dice at </w:t>
+        <w:t>Because this technical series contains six images without patient-level sampling metadata, we report individual specimens, ranges and descriptive means rather than inferential P values. Confidence intervals or claims of population generalization would be inappropriate. A subsequent locked evaluation should use patient-level splits, boundary IoU and normalized surface Dice at a prespecified physical tolerance, paired effect sizes and patient-clustered bootstrap confidence intervals.</w:t>
       </w:r>
+    </w:p>
+    <w:p>
+      <w:pPr>
+        <w:pStyle w:val="Heading3"/>
+      </w:pPr>
       <w:r>
-        <w:rPr>
-          <w:rFonts w:ascii="Calibri" w:hAnsi="Calibri"/>
-          <w:b/>
-          <w:color w:val="9C5C00"/>
-          <w:sz w:val="22"/>
-          <w:highlight w:val="yellow"/>
-        </w:rPr>
-        <w:t>[D]</w:t>
+        <w:t>3.12 Implementation and reproducibility</w:t>
       </w:r>
+    </w:p>
+    <w:p>
+      <w:pPr>
+        <w:jc w:val="both"/>
+      </w:pPr>
       <w:r>
         <w:rPr>
           <w:rFonts w:ascii="Calibri" w:hAnsi="Calibri"/>
           <w:sz w:val="22"/>
         </w:rPr>
-        <w:t xml:space="preserve"> µm. Secondary metrics are per-class Dice, Jaccard index, average symmetric surface distance, HD95, false-positive and false-negative boundary displacement, component count error, label disappearance rate, changed-core pixel count, raster-vector round-trip error, wall time, tiles processed, peak RAM, and peak accelerator memory. Metrics are computed per slide and per class; absent-class handling is specified before analysis.</w:t>
+        <w:t>Bora is implemented in Python 3.10 using NumPy, SciPy, scikit-image, tifffile, Rasterio, Shapely, Pillow and pyvips. Reference rasterization and tile aggregation used the OpenMP-enabled C++ implementation of tiling-mask. The default run used four output workers, 2,048-pixel streaming blocks, a 64-pixel annealed boundary radius evaluated at four-fold downsampling, 16-pixel core erosion, 24-pixel outer dilation and native-resolution watershed. Categorical pyramids used nearest-neighbour (SIMPLE) downsampling and lossless LZW compression. Source code is maintained at &lt;https://github.com/tkcaccia/Bora&gt;; a versioned release, licence and archival DOI must be supplied before submission.</w:t>
+      </w:r>
+    </w:p>
+    <w:p>
+      <w:pPr>
+        <w:pStyle w:val="Heading2"/>
+      </w:pPr>
+      <w:r>
+        <w:t>4. Discussion</w:t>
       </w:r>
     </w:p>
     <w:p>
@@ -1539,83 +1157,55 @@
           <w:rFonts w:ascii="Calibri" w:hAnsi="Calibri"/>
           <w:sz w:val="22"/>
         </w:rPr>
-        <w:t xml:space="preserve">Primary comparisons use paired </w:t>
+        <w:t>This study asked whether pixel-level tissue boundaries can be recovered from coarse tile labels by restricting image-driven inference to a narrow, explicitly governed search region. The answer depends on what constitutes a boundary. Bora improved the union of foreground classes in every fully scored image, yet usually reduced multiclass overlap. This divergence is not a contradiction: the visible tissue edge and the semantic interface between two annotated regions are different estimation problems.</w:t>
       </w:r>
-      <w:r>
-        <w:rPr>
-          <w:rFonts w:ascii="Calibri" w:hAnsi="Calibri"/>
-          <w:b/>
-          <w:color w:val="9C5C00"/>
-          <w:sz w:val="22"/>
-          <w:highlight w:val="yellow"/>
-        </w:rPr>
-        <w:t>[WILCOXON/SIGN-FLIP/PERMUTATION]</w:t>
-      </w:r>
+    </w:p>
+    <w:p>
+      <w:pPr>
+        <w:jc w:val="both"/>
+      </w:pPr>
       <w:r>
         <w:rPr>
           <w:rFonts w:ascii="Calibri" w:hAnsi="Calibri"/>
           <w:sz w:val="22"/>
         </w:rPr>
-        <w:t xml:space="preserve"> tests at slide level with effect sizes and 95% bootstrap confidence intervals clustered by patient. Multiplicity across two primary endpoints and </w:t>
+        <w:t>Bora does not replace the upstream semantic classifier. It assumes that tile labels are broadly correct and uses them to define identity and protected interiors. The present results show that these safeguards are necessary but not sufficient. A protected core prevents wholesale class erasure, while millions of individually plausible border updates can still produce a measurable loss in class IoU. The tissue-array result is particularly informative: foreground Dice increased while macro IoU fell by more than 0.016, demonstrating why a binary metric alone is inadequate for multiclass refinement.</w:t>
       </w:r>
-      <w:r>
-        <w:rPr>
-          <w:rFonts w:ascii="Calibri" w:hAnsi="Calibri"/>
-          <w:b/>
-          <w:color w:val="9C5C00"/>
-          <w:sz w:val="22"/>
-          <w:highlight w:val="yellow"/>
-        </w:rPr>
-        <w:t>[N]</w:t>
-      </w:r>
+    </w:p>
+    <w:p>
+      <w:pPr>
+        <w:jc w:val="both"/>
+      </w:pPr>
       <w:r>
         <w:rPr>
           <w:rFonts w:ascii="Calibri" w:hAnsi="Calibri"/>
           <w:sz w:val="22"/>
         </w:rPr>
-        <w:t xml:space="preserve"> methods is controlled using </w:t>
+        <w:t>The evaluation emphasizes both foreground and class-aware metrics because region overlap is relatively insensitive to contour errors in large tissue compartments [1]. Dice remains useful for comparability but is insufficient as the sole endpoint. Conversely, a sharp boundary score alone cannot establish semantic correctness. Future validation should combine boundary fidelity, class retention, topology, vector consistency, failure frequency and computational resource use.</w:t>
       </w:r>
-      <w:r>
-        <w:rPr>
-          <w:rFonts w:ascii="Calibri" w:hAnsi="Calibri"/>
-          <w:b/>
-          <w:color w:val="9C5C00"/>
-          <w:sz w:val="22"/>
-          <w:highlight w:val="yellow"/>
-        </w:rPr>
-        <w:t>[HOLM PROCEDURE]</w:t>
-      </w:r>
+    </w:p>
+    <w:p>
+      <w:pPr>
+        <w:jc w:val="both"/>
+      </w:pPr>
       <w:r>
         <w:rPr>
           <w:rFonts w:ascii="Calibri" w:hAnsi="Calibri"/>
           <w:sz w:val="22"/>
         </w:rPr>
-        <w:t xml:space="preserve">. Scanner, institution, stain, tissue class, baseline boundary quality, segment size, and label count define prespecified subgroup analyses. Report distributions and individual-slide points, not only means. A failure is any crash, empty output for a present label, core-invariant violation, invalid geometry, or runtime above </w:t>
+        <w:t>MedSAM offers spatially prompted, medical-domain segmentation [4], whereas PathSegmentor introduces pathology-specific text prompting [6]. Neither model was included in the reported default-chain benchmark. Their future comparison should test whether explicit class semantics improve boundary selection when neighbouring tissues have similar morphology. Any advantage must be interpreted with awareness of overlap between training sources and evaluation datasets. Labels with natural semantic names must also be separated from arbitrary clusters, for which text prompting is not well defined.</w:t>
       </w:r>
-      <w:r>
-        <w:rPr>
-          <w:rFonts w:ascii="Calibri" w:hAnsi="Calibri"/>
-          <w:b/>
-          <w:color w:val="9C5C00"/>
-          <w:sz w:val="22"/>
-          <w:highlight w:val="yellow"/>
-        </w:rPr>
-        <w:t>[LIMIT]</w:t>
-      </w:r>
+    </w:p>
+    <w:p>
+      <w:pPr>
+        <w:jc w:val="both"/>
+      </w:pPr>
       <w:r>
         <w:rPr>
           <w:rFonts w:ascii="Calibri" w:hAnsi="Calibri"/>
           <w:sz w:val="22"/>
         </w:rPr>
-        <w:t>; failures remain in the intention-to-process analysis using the prespecified worst-score rule.</w:t>
-      </w:r>
-    </w:p>
-    <w:p>
-      <w:pPr>
-        <w:pStyle w:val="Heading3"/>
-      </w:pPr>
-      <w:r>
-        <w:t>2.12 Implementation and reproducibility</w:t>
+        <w:t>Important limitations constrain interpretation. First, the reference masks were computationally rasterized from existing GeoJSON rather than independently traced by blinded pathologists. Second, the six images do not constitute a patient-level cohort and cannot support clinical generalization or formal population inference. Third, the comparison isolates a 56-pixel tiling transformation but does not model upstream classification errors. Fourth, the current evaluation lacks boundary-distance metrics, topology analysis and stage-wise ablation, so it cannot attribute error separately to annealed competition and watershed. Finally, refinement depends on the upstream mask and cannot recover a wholly missed region outside its search envelope. Native watershed is also sensitive to weak gradients and stain artefacts.</w:t>
       </w:r>
     </w:p>
     <w:p>
@@ -1627,339 +1217,39 @@
           <w:rFonts w:ascii="Calibri" w:hAnsi="Calibri"/>
           <w:sz w:val="22"/>
         </w:rPr>
-        <w:t xml:space="preserve">Bora is implemented in </w:t>
+        <w:t>The most direct improvement is to partition the editable set into external and internal interfaces. Image-driven watershed can be retained for tissue-background borders, where RGB evidence is usually meaningful. Internal class interfaces should use a conservative geometric prior unless an image model produces calibrated evidence above a threshold. A graph formulation could combine a strong unary penalty for changing the tile label, a weaker image-edge term, class-specific area constraints and a maximum displacement of substantially less than half the 56-pixel tile width. Rare labels should receive narrower bands and higher overwrite thresholds. These changes should be selected on development tissues and evaluated once on held-out specimens to avoid optimizing against the test GeoJSON.</w:t>
       </w:r>
-      <w:r>
-        <w:rPr>
-          <w:rFonts w:ascii="Calibri" w:hAnsi="Calibri"/>
-          <w:b/>
-          <w:color w:val="9C5C00"/>
-          <w:sz w:val="22"/>
-          <w:highlight w:val="yellow"/>
-        </w:rPr>
-        <w:t>[PYTHON VERSION]</w:t>
-      </w:r>
+    </w:p>
+    <w:p>
+      <w:pPr>
+        <w:jc w:val="both"/>
+      </w:pPr>
       <w:r>
         <w:rPr>
           <w:rFonts w:ascii="Calibri" w:hAnsi="Calibri"/>
           <w:sz w:val="22"/>
         </w:rPr>
-        <w:t xml:space="preserve"> using </w:t>
+        <w:t>Bora already provides a practical engineering bridge between inexpensive tile classification and geometry-aware downstream analysis. Its scientific value is equally diagnostic: it makes the failure mode measurable rather than hiding it behind a foreground score. Clinical or biological utility requires a separate task-specific study; improved image metrics alone would not demonstrate diagnostic benefit.</w:t>
       </w:r>
+    </w:p>
+    <w:p>
+      <w:pPr>
+        <w:pStyle w:val="Heading2"/>
+      </w:pPr>
       <w:r>
-        <w:rPr>
-          <w:rFonts w:ascii="Calibri" w:hAnsi="Calibri"/>
-          <w:b/>
-          <w:color w:val="9C5C00"/>
-          <w:sz w:val="22"/>
-          <w:highlight w:val="yellow"/>
-        </w:rPr>
-        <w:t>[LIBRARIES AND VERSIONS]</w:t>
+        <w:t>5. Conclusion</w:t>
       </w:r>
+    </w:p>
+    <w:p>
+      <w:pPr>
+        <w:jc w:val="both"/>
+      </w:pPr>
       <w:r>
         <w:rPr>
           <w:rFonts w:ascii="Calibri" w:hAnsi="Calibri"/>
           <w:sz w:val="22"/>
         </w:rPr>
-        <w:t xml:space="preserve">. Experiments will freeze the Bora commit, CellPhenotyper source commit, model checkpoint checksum, and container digest. Random seeds and deterministic settings are </w:t>
-      </w:r>
-      <w:r>
-        <w:rPr>
-          <w:rFonts w:ascii="Calibri" w:hAnsi="Calibri"/>
-          <w:b/>
-          <w:color w:val="9C5C00"/>
-          <w:sz w:val="22"/>
-          <w:highlight w:val="yellow"/>
-        </w:rPr>
-        <w:t>[DETAILS]</w:t>
-      </w:r>
-      <w:r>
-        <w:rPr>
-          <w:rFonts w:ascii="Calibri" w:hAnsi="Calibri"/>
-          <w:sz w:val="22"/>
-        </w:rPr>
-        <w:t xml:space="preserve">. Hardware is </w:t>
-      </w:r>
-      <w:r>
-        <w:rPr>
-          <w:rFonts w:ascii="Calibri" w:hAnsi="Calibri"/>
-          <w:b/>
-          <w:color w:val="9C5C00"/>
-          <w:sz w:val="22"/>
-          <w:highlight w:val="yellow"/>
-        </w:rPr>
-        <w:t>[CPU, RAM, GPU]</w:t>
-      </w:r>
-      <w:r>
-        <w:rPr>
-          <w:rFonts w:ascii="Calibri" w:hAnsi="Calibri"/>
-          <w:sz w:val="22"/>
-        </w:rPr>
-        <w:t xml:space="preserve">. Source code will be released at https://github.com/tkcaccia/Bora under </w:t>
-      </w:r>
-      <w:r>
-        <w:rPr>
-          <w:rFonts w:ascii="Calibri" w:hAnsi="Calibri"/>
-          <w:b/>
-          <w:color w:val="9C5C00"/>
-          <w:sz w:val="22"/>
-          <w:highlight w:val="yellow"/>
-        </w:rPr>
-        <w:t>[LICENSE]</w:t>
-      </w:r>
-      <w:r>
-        <w:rPr>
-          <w:rFonts w:ascii="Calibri" w:hAnsi="Calibri"/>
-          <w:sz w:val="22"/>
-        </w:rPr>
-        <w:t xml:space="preserve">, and an archival DOI will be created at </w:t>
-      </w:r>
-      <w:r>
-        <w:rPr>
-          <w:rFonts w:ascii="Calibri" w:hAnsi="Calibri"/>
-          <w:b/>
-          <w:color w:val="9C5C00"/>
-          <w:sz w:val="22"/>
-          <w:highlight w:val="yellow"/>
-        </w:rPr>
-        <w:t>[ZENODO DOI]</w:t>
-      </w:r>
-      <w:r>
-        <w:rPr>
-          <w:rFonts w:ascii="Calibri" w:hAnsi="Calibri"/>
-          <w:sz w:val="22"/>
-        </w:rPr>
-        <w:t xml:space="preserve">. Data and annotations will be shared at </w:t>
-      </w:r>
-      <w:r>
-        <w:rPr>
-          <w:rFonts w:ascii="Calibri" w:hAnsi="Calibri"/>
-          <w:b/>
-          <w:color w:val="9C5C00"/>
-          <w:sz w:val="22"/>
-          <w:highlight w:val="yellow"/>
-        </w:rPr>
-        <w:t>[REPOSITORY]</w:t>
-      </w:r>
-      <w:r>
-        <w:rPr>
-          <w:rFonts w:ascii="Calibri" w:hAnsi="Calibri"/>
-          <w:sz w:val="22"/>
-        </w:rPr>
-        <w:t xml:space="preserve"> subject to </w:t>
-      </w:r>
-      <w:r>
-        <w:rPr>
-          <w:rFonts w:ascii="Calibri" w:hAnsi="Calibri"/>
-          <w:b/>
-          <w:color w:val="9C5C00"/>
-          <w:sz w:val="22"/>
-          <w:highlight w:val="yellow"/>
-        </w:rPr>
-        <w:t>[ACCESS CONDITIONS]</w:t>
-      </w:r>
-      <w:r>
-        <w:rPr>
-          <w:rFonts w:ascii="Calibri" w:hAnsi="Calibri"/>
-          <w:sz w:val="22"/>
-        </w:rPr>
-        <w:t>. A synthetic, redistributable example should be included for continuous integration.</w:t>
-      </w:r>
-    </w:p>
-    <w:p>
-      <w:pPr>
-        <w:pStyle w:val="Heading2"/>
-      </w:pPr>
-      <w:r>
-        <w:t>3. Results</w:t>
-      </w:r>
-    </w:p>
-    <w:p>
-      <w:pPr>
-        <w:pStyle w:val="Heading3"/>
-      </w:pPr>
-      <w:r>
-        <w:t>3.1 Cohort and processing characteristics</w:t>
-      </w:r>
-    </w:p>
-    <w:p>
-      <w:pPr>
-        <w:jc w:val="both"/>
-      </w:pPr>
-      <w:r>
-        <w:rPr>
-          <w:rFonts w:ascii="Calibri" w:hAnsi="Calibri"/>
-          <w:sz w:val="22"/>
-        </w:rPr>
-        <w:t>Placeholder-do not infer values. Report the participant/slide flow, image dimensions, physical resolution, tissue classes, segment counts, editable-band fraction, and reference-annotation coverage. Table 1 should distinguish development, internal test, and external test data.</w:t>
-      </w:r>
-    </w:p>
-    <w:p>
-      <w:pPr>
-        <w:pStyle w:val="Heading3"/>
-      </w:pPr>
-      <w:r>
-        <w:t>3.2 Primary boundary-refinement performance</w:t>
-      </w:r>
-    </w:p>
-    <w:p>
-      <w:pPr>
-        <w:jc w:val="both"/>
-      </w:pPr>
-      <w:r>
-        <w:rPr>
-          <w:rFonts w:ascii="Calibri" w:hAnsi="Calibri"/>
-          <w:sz w:val="22"/>
-        </w:rPr>
-        <w:t>Placeholder. Report Boundary IoU and normalized surface Dice for every comparator with paired differences, confidence intervals, adjusted p values, and failure counts. State explicitly whether both primary hypotheses were supported. Figure 2 should show representative successes and failures selected by a prespecified rule rather than visual preference.</w:t>
-      </w:r>
-    </w:p>
-    <w:p>
-      <w:pPr>
-        <w:pStyle w:val="Heading3"/>
-      </w:pPr>
-      <w:r>
-        <w:t>3.3 Region overlap, topology, and label safety</w:t>
-      </w:r>
-    </w:p>
-    <w:p>
-      <w:pPr>
-        <w:jc w:val="both"/>
-      </w:pPr>
-      <w:r>
-        <w:rPr>
-          <w:rFonts w:ascii="Calibri" w:hAnsi="Calibri"/>
-          <w:sz w:val="22"/>
-        </w:rPr>
-        <w:t>Placeholder. Report Dice/IoU alongside component errors, label loss, core-invariant violations, and changes in segment adjacency. A boundary improvement should not be described as clinically meaningful unless the magnitude is related to annotator variability or a downstream measurement.</w:t>
-      </w:r>
-    </w:p>
-    <w:p>
-      <w:pPr>
-        <w:pStyle w:val="Heading3"/>
-      </w:pPr>
-      <w:r>
-        <w:t>3.4 Generalization and subgroup analyses</w:t>
-      </w:r>
-    </w:p>
-    <w:p>
-      <w:pPr>
-        <w:jc w:val="both"/>
-      </w:pPr>
-      <w:r>
-        <w:rPr>
-          <w:rFonts w:ascii="Calibri" w:hAnsi="Calibri"/>
-          <w:sz w:val="22"/>
-        </w:rPr>
-        <w:t>Placeholder. Report external-site results and stratification by scanner, stain, tissue type, segment size, baseline error, and number of labels. Clearly identify exploratory analyses.</w:t>
-      </w:r>
-    </w:p>
-    <w:p>
-      <w:pPr>
-        <w:pStyle w:val="Heading3"/>
-      </w:pPr>
-      <w:r>
-        <w:t>3.5 Ablation and computational performance</w:t>
-      </w:r>
-    </w:p>
-    <w:p>
-      <w:pPr>
-        <w:jc w:val="both"/>
-      </w:pPr>
-      <w:r>
-        <w:rPr>
-          <w:rFonts w:ascii="Calibri" w:hAnsi="Calibri"/>
-          <w:sz w:val="22"/>
-        </w:rPr>
-        <w:t>Placeholder. Quantify the incremental value of annealed-wand competition, native watershed, core protection, overlap, and each promptable backend. Report end-to-end runtime, throughput, peak memory, processed-area fraction, and scaling with image area, boundary length, and label count.</w:t>
-      </w:r>
-    </w:p>
-    <w:p>
-      <w:pPr>
-        <w:pStyle w:val="Heading2"/>
-      </w:pPr>
-      <w:r>
-        <w:t>4. Discussion</w:t>
-      </w:r>
-    </w:p>
-    <w:p>
-      <w:pPr>
-        <w:jc w:val="both"/>
-      </w:pPr>
-      <w:r>
-        <w:rPr>
-          <w:rFonts w:ascii="Calibri" w:hAnsi="Calibri"/>
-          <w:sz w:val="22"/>
-        </w:rPr>
-        <w:t>This study is designed to determine whether pixel-level tissue boundaries can be recovered from coarse tile labels by restricting promptable-model inference to a narrow, explicitly governed search region. Bora does not replace the upstream semantic classifier: it assumes that tile labels are broadly correct and uses them to define identity, prompts, and immutable interiors. This distinction is important. Unconstrained re-segmentation may correct boundaries but can also erase rare labels, exchange adjacent classes, or hallucinate tissue in slide background. The protected-core invariant and auditable competition rule are intended to make such failures detectable.</w:t>
-      </w:r>
-    </w:p>
-    <w:p>
-      <w:pPr>
-        <w:jc w:val="both"/>
-      </w:pPr>
-      <w:r>
-        <w:rPr>
-          <w:rFonts w:ascii="Calibri" w:hAnsi="Calibri"/>
-          <w:sz w:val="22"/>
-        </w:rPr>
-        <w:t>The proposed evaluation emphasizes boundary metrics because region overlap is relatively insensitive to contour errors in large tissue compartments [1]. Dice remains useful for comparability but is insufficient as the sole endpoint. Conversely, a sharp boundary score alone cannot establish semantic correctness. The benchmark therefore combines boundary fidelity, class retention, topology, vector consistency, failure frequency, and computational resource use.</w:t>
-      </w:r>
-    </w:p>
-    <w:p>
-      <w:pPr>
-        <w:jc w:val="both"/>
-      </w:pPr>
-      <w:r>
-        <w:rPr>
-          <w:rFonts w:ascii="Calibri" w:hAnsi="Calibri"/>
-          <w:sz w:val="22"/>
-        </w:rPr>
-        <w:t>MedSAM offers spatially prompted, medical-domain segmentation [4], whereas PathSegmentor introduces pathology-specific text prompting [6]. Their comparison tests whether explicit class semantics improve boundary selection when neighbouring tissues have similar morphology. Any PathSegmentor advantage must be interpreted with awareness of possible overlap between its training sources and evaluation datasets; public-dataset provenance and leakage checks are required. Results should also separate labels with natural semantic names from arbitrary clusters, for which text prompting is not well defined.</w:t>
-      </w:r>
-    </w:p>
-    <w:p>
-      <w:pPr>
-        <w:jc w:val="both"/>
-      </w:pPr>
-      <w:r>
-        <w:rPr>
-          <w:rFonts w:ascii="Calibri" w:hAnsi="Calibri"/>
-          <w:sz w:val="22"/>
-        </w:rPr>
-        <w:t>Anticipated limitations include dependence on the upstream mask, imperfect calibration metadata, ambiguity at mixed or transitional tissue interfaces, model sensitivity to stain and scanner variation, and potential fragmentation during tiled raster-to-vector conversion. Boundary-only refinement cannot recover a wholly missed region far outside the outer envelope and may preserve an incorrect interior by design. Annealed-wand competition changes label identity only where foreground labels already meet and therefore cannot recover missing foreground. Native watershed is sensitive to weak gradients and stain artefacts. All radii should be evaluated in physical rather than purely pixel units.</w:t>
-      </w:r>
-    </w:p>
-    <w:p>
-      <w:pPr>
-        <w:jc w:val="both"/>
-      </w:pPr>
-      <w:r>
-        <w:rPr>
-          <w:rFonts w:ascii="Calibri" w:hAnsi="Calibri"/>
-          <w:sz w:val="22"/>
-        </w:rPr>
-        <w:t>If validated, Bora could provide a practical bridge between inexpensive tile classification and geometry-aware downstream analysis. Clinical or biological utility, however, requires a separate task-specific study; improved image metrics alone do not demonstrate diagnostic benefit.</w:t>
-      </w:r>
-    </w:p>
-    <w:p>
-      <w:pPr>
-        <w:pStyle w:val="Heading2"/>
-      </w:pPr>
-      <w:r>
-        <w:t>5. Conclusion</w:t>
-      </w:r>
-    </w:p>
-    <w:p>
-      <w:pPr>
-        <w:jc w:val="both"/>
-      </w:pPr>
-      <w:r>
-        <w:rPr>
-          <w:rFonts w:ascii="Calibri" w:hAnsi="Calibri"/>
-          <w:sz w:val="22"/>
-        </w:rPr>
-        <w:t>Bora is a proposed boundary-constrained framework for converting multi-label tile masks into full-resolution tissue segmentations and matched vector geometries. Its central design is to spend computation at uncertain borders while preserving confident interiors and semantic identifiers. Conclusions about accuracy, generalization, or efficiency are deferred until the prespecified internal and external benchmarks are completed.</w:t>
+        <w:t>Bora converts multiclass tile grids into full-resolution, pyramidal raster masks and matched vector geometries using bounded-memory boundary processing. Across a controlled gigapixel benchmark, the default chain consistently improved binary tissue extent but usually reduced multiclass semantic overlap, with the largest relative errors in small regions. The result establishes that foreground recovery and semantic preservation must be optimized separately. Conservative, confidence-gated and class-adaptive refinement is therefore not merely an implementation preference but the principal requirement for the next generation of coarse-to-fine pathology segmentation.</w:t>
       </w:r>
     </w:p>
     <w:p>
@@ -2248,7 +1538,7 @@
           <w:rFonts w:ascii="Calibri" w:hAnsi="Calibri"/>
           <w:sz w:val="22"/>
         </w:rPr>
-        <w:t>Figure 1: Bora workflow: coarse labels -&gt; annealed-wand competition -&gt; native watershed/protected cores -&gt; optional prompts -&gt; constrained fusion -&gt; pyramidal OME-TIFF and GeoJSON.</w:t>
+        <w:t>Figure 1: Bora workflow: GeoJSON-derived reference -&gt; majority-vote tile mask -&gt; annealed competition -&gt; constrained watershed -&gt; pyramidal OME-TIFF and GeoJSON.</w:t>
       </w:r>
     </w:p>
     <w:p>
@@ -2264,7 +1554,7 @@
           <w:rFonts w:ascii="Calibri" w:hAnsi="Calibri"/>
           <w:sz w:val="22"/>
         </w:rPr>
-        <w:t>Figure 2: Prespecified representative internal and external cases with image, coarse mask, reference, comparator outputs, and signed boundary-error maps.</w:t>
+        <w:t>Figure 2: Paired changes in foreground Dice, macro IoU and pixel accuracy for all specimens, with zero-change reference lines.</w:t>
       </w:r>
     </w:p>
     <w:p>
@@ -2280,7 +1570,7 @@
           <w:rFonts w:ascii="Calibri" w:hAnsi="Calibri"/>
           <w:sz w:val="22"/>
         </w:rPr>
-        <w:t>Figure 3: Paired primary endpoint distributions and per-class effects with patient-clustered confidence intervals.</w:t>
+        <w:t>Figure 3: Representative success and failure cases showing RGB image, coarse grid, reference, Bora output and signed class-error maps.</w:t>
       </w:r>
     </w:p>
     <w:p>
@@ -2296,7 +1586,7 @@
           <w:rFonts w:ascii="Calibri" w:hAnsi="Calibri"/>
           <w:sz w:val="22"/>
         </w:rPr>
-        <w:t>Figure 4: Accuracy-efficiency trade-off and scaling with boundary length and label count.</w:t>
+        <w:t>Figure 4: Class-wise IoU change against reference class area, highlighting vulnerability of small regions.</w:t>
       </w:r>
     </w:p>
     <w:p>
@@ -2312,7 +1602,7 @@
           <w:rFonts w:ascii="Calibri" w:hAnsi="Calibri"/>
           <w:sz w:val="22"/>
         </w:rPr>
-        <w:t>Figure 5: Failure taxonomy and uncertainty/QC signals.</w:t>
+        <w:t>Table 1: Image dimensions, class counts, processed blocks and runtime.</w:t>
       </w:r>
     </w:p>
     <w:p>
@@ -2328,7 +1618,7 @@
           <w:rFonts w:ascii="Calibri" w:hAnsi="Calibri"/>
           <w:sz w:val="22"/>
         </w:rPr>
-        <w:t>Table 1: Cohort and acquisition characteristics.</w:t>
+        <w:t>Table 2: Baseline, Bora and paired changes for all reported overlap metrics.</w:t>
       </w:r>
     </w:p>
     <w:p>
@@ -2344,23 +1634,7 @@
           <w:rFonts w:ascii="Calibri" w:hAnsi="Calibri"/>
           <w:sz w:val="22"/>
         </w:rPr>
-        <w:t>Table 2: Primary and secondary segmentation endpoints.</w:t>
-      </w:r>
-    </w:p>
-    <w:p>
-      <w:pPr>
-        <w:spacing w:after="80" w:line="290" w:lineRule="auto"/>
-        <w:numPr>
-          <w:ilvl w:val="0"/>
-          <w:numId w:val="12"/>
-        </w:numPr>
-      </w:pPr>
-      <w:r>
-        <w:rPr>
-          <w:rFonts w:ascii="Calibri" w:hAnsi="Calibri"/>
-          <w:sz w:val="22"/>
-        </w:rPr>
-        <w:t>Table 3: Ablations, runtime, memory, and failure rates.</w:t>
+        <w:t>Extended Data Table 1: Stage-wise ablations and conservative-refinement parameter sweep.</w:t>
       </w:r>
     </w:p>
     <w:p>
@@ -2578,31 +1852,7 @@
           <w:rFonts w:ascii="Calibri" w:hAnsi="Calibri"/>
           <w:sz w:val="22"/>
         </w:rPr>
-        <w:t>Freeze the research question, endpoints, tolerance distances, and statistical plan before testing.</w:t>
-      </w:r>
-    </w:p>
-    <w:p>
-      <w:pPr>
-        <w:pStyle w:val="ListBullet"/>
-      </w:pPr>
-      <w:r>
-        <w:rPr>
-          <w:rFonts w:ascii="Calibri" w:hAnsi="Calibri"/>
-          <w:sz w:val="22"/>
-        </w:rPr>
-        <w:t>Populate all bracketed fields; remove protocol language once results exist.</w:t>
-      </w:r>
-    </w:p>
-    <w:p>
-      <w:pPr>
-        <w:pStyle w:val="ListBullet"/>
-      </w:pPr>
-      <w:r>
-        <w:rPr>
-          <w:rFonts w:ascii="Calibri" w:hAnsi="Calibri"/>
-          <w:sz w:val="22"/>
-        </w:rPr>
-        <w:t>Add a complete dataset/provenance table and a leakage assessment.</w:t>
+        <w:t>Add complete dataset provenance, licences and a training-data leakage assessment.</w:t>
       </w:r>
     </w:p>
     <w:p>
@@ -2674,7 +1924,7 @@
           <w:rFonts w:ascii="Calibri" w:hAnsi="Calibri"/>
           <w:sz w:val="22"/>
         </w:rPr>
-        <w:t>Follow the Medical Image Analysis author guide current at submission; Elsevier describes typical original articles as approximately 3,000-6,000 words with 3-5 figures and 30-50 references, but the journal’s live requirements take precedence.</w:t>
+        <w:t>Complete the Nature Portfolio reporting summary and follow the live target-journal requirements at submission.</w:t>
       </w:r>
     </w:p>
     <w:sectPr>
@@ -2702,7 +1952,7 @@
         <w:color w:val="5C6370"/>
         <w:sz w:val="18"/>
       </w:rPr>
-      <w:t xml:space="preserve">Protocol-stage draft  |  </w:t>
+      <w:t xml:space="preserve">Technical benchmark draft  |  </w:t>
     </w:r>
     <w:r>
       <w:rPr>
@@ -2732,7 +1982,7 @@
         <w:color w:val="5C6370"/>
         <w:sz w:val="18"/>
       </w:rPr>
-      <w:t>Bora | Medical Image Analysis manuscript</w:t>
+      <w:t>Bora | Nature Communications manuscript</w:t>
     </w:r>
   </w:p>
 </w:hdr>

</xml_diff>